<commit_message>
Deploy preview for PR 605 🛫
</commit_message>
<xml_diff>
--- a/pr-preview/pr-605/vignettes/articles/version-crosswalk-1.3-to-1.4.docx
+++ b/pr-preview/pr-605/vignettes/articles/version-crosswalk-1.3-to-1.4.docx
@@ -1699,70 +1699,70 @@
         <w:rPr>
           <w:rStyle w:val="VerbatimChar"/>
         </w:rPr>
-        <w:t xml:space="preserve">#&gt;     age id    antigen_iso   value</w:t>
-      </w:r>
-      <w:r>
-        <w:br/>
-      </w:r>
-      <w:r>
-        <w:rPr>
-          <w:rStyle w:val="VerbatimChar"/>
-        </w:rPr>
-        <w:t xml:space="preserve">#&gt;   &lt;dbl&gt; &lt;chr&gt; &lt;chr&gt;         &lt;dbl&gt;</w:t>
-      </w:r>
-      <w:r>
-        <w:br/>
-      </w:r>
-      <w:r>
-        <w:rPr>
-          <w:rStyle w:val="VerbatimChar"/>
-        </w:rPr>
-        <w:t xml:space="preserve">#&gt; 1  7.04 1     HlyE_IgA      0.636</w:t>
-      </w:r>
-      <w:r>
-        <w:br/>
-      </w:r>
-      <w:r>
-        <w:rPr>
-          <w:rStyle w:val="VerbatimChar"/>
-        </w:rPr>
-        <w:t xml:space="preserve">#&gt; 2  7.04 1     HlyE_IgG      0.345</w:t>
-      </w:r>
-      <w:r>
-        <w:br/>
-      </w:r>
-      <w:r>
-        <w:rPr>
-          <w:rStyle w:val="VerbatimChar"/>
-        </w:rPr>
-        <w:t xml:space="preserve">#&gt; 3  0.45 2     HlyE_IgA      0.203</w:t>
-      </w:r>
-      <w:r>
-        <w:br/>
-      </w:r>
-      <w:r>
-        <w:rPr>
-          <w:rStyle w:val="VerbatimChar"/>
-        </w:rPr>
-        <w:t xml:space="preserve">#&gt; 4  0.45 2     HlyE_IgG      0.285</w:t>
-      </w:r>
-      <w:r>
-        <w:br/>
-      </w:r>
-      <w:r>
-        <w:rPr>
-          <w:rStyle w:val="VerbatimChar"/>
-        </w:rPr>
-        <w:t xml:space="preserve">#&gt; 5 19.8  3     HlyE_IgA    177.   </w:t>
-      </w:r>
-      <w:r>
-        <w:br/>
-      </w:r>
-      <w:r>
-        <w:rPr>
-          <w:rStyle w:val="VerbatimChar"/>
-        </w:rPr>
-        <w:t xml:space="preserve">#&gt; 6 19.8  3     HlyE_IgG     13.4</w:t>
+        <w:t xml:space="preserve">#&gt;     age id    antigen_iso  value</w:t>
+      </w:r>
+      <w:r>
+        <w:br/>
+      </w:r>
+      <w:r>
+        <w:rPr>
+          <w:rStyle w:val="VerbatimChar"/>
+        </w:rPr>
+        <w:t xml:space="preserve">#&gt;   &lt;dbl&gt; &lt;chr&gt; &lt;chr&gt;        &lt;dbl&gt;</w:t>
+      </w:r>
+      <w:r>
+        <w:br/>
+      </w:r>
+      <w:r>
+        <w:rPr>
+          <w:rStyle w:val="VerbatimChar"/>
+        </w:rPr>
+        <w:t xml:space="preserve">#&gt; 1  13.0 1     HlyE_IgA     0.439</w:t>
+      </w:r>
+      <w:r>
+        <w:br/>
+      </w:r>
+      <w:r>
+        <w:rPr>
+          <w:rStyle w:val="VerbatimChar"/>
+        </w:rPr>
+        <w:t xml:space="preserve">#&gt; 2  13.0 1     HlyE_IgG     4.40 </w:t>
+      </w:r>
+      <w:r>
+        <w:br/>
+      </w:r>
+      <w:r>
+        <w:rPr>
+          <w:rStyle w:val="VerbatimChar"/>
+        </w:rPr>
+        <w:t xml:space="preserve">#&gt; 3  18.3 2     HlyE_IgA     2.42 </w:t>
+      </w:r>
+      <w:r>
+        <w:br/>
+      </w:r>
+      <w:r>
+        <w:rPr>
+          <w:rStyle w:val="VerbatimChar"/>
+        </w:rPr>
+        <w:t xml:space="preserve">#&gt; 4  18.3 2     HlyE_IgG    66.5  </w:t>
+      </w:r>
+      <w:r>
+        <w:br/>
+      </w:r>
+      <w:r>
+        <w:rPr>
+          <w:rStyle w:val="VerbatimChar"/>
+        </w:rPr>
+        <w:t xml:space="preserve">#&gt; 5  12.6 3     HlyE_IgA     0.328</w:t>
+      </w:r>
+      <w:r>
+        <w:br/>
+      </w:r>
+      <w:r>
+        <w:rPr>
+          <w:rStyle w:val="VerbatimChar"/>
+        </w:rPr>
+        <w:t xml:space="preserve">#&gt; 6  12.6 3     HlyE_IgG     0.652</w:t>
       </w:r>
       <w:r>
         <w:br/>

</xml_diff>